<commit_message>
Clarify worker-scaling chart + fix breakdown to clean per-request decomposition
Worker scaling chart: dual-axis (throughput bars + autoscaled speedup line with
value labels) so the peak-at-2-3-then-decline is readable; the misleading
ideal-to-8 line is moved to the title note.

Breakdown: re-measured at concurrency=1 (no contention / batch-merging
inflation). queue is now a flat ~6.5ms window floor; 'other' (communication)
scales with payload; compute overtakes it for large requests. Verified the
large queue/communication previously shown was NOT a bug via a controlled
A/B/C test (direct vs dispatcher, conc=1 vs 16): communication is only ~0.9ms
per 1MB in isolation; high-concurrency numbers reflect batching merging
16x1MB into one 16MB worker call. README + REPORT updated; PDF/docx regenerated.

Co-Authored-By: Claude Opus 4.8 <noreply@anthropic.com>
</commit_message>
<xml_diff>
--- a/REPORT.docx
+++ b/REPORT.docx
@@ -5857,7 +5857,7 @@
         <w:rPr/>
         <w:drawing>
           <wp:inline distT="0" distB="0" distL="0" distR="0">
-            <wp:extent cx="4785360" cy="3596640"/>
+            <wp:extent cx="6134100" cy="4122420"/>
             <wp:effectExtent l="0" t="0" r="0" b="0"/>
             <wp:docPr id="3" name="Image3" descr=""/>
             <wp:cNvGraphicFramePr>
@@ -5881,7 +5881,7 @@
                   <pic:spPr bwMode="auto">
                     <a:xfrm>
                       <a:off x="0" y="0"/>
-                      <a:ext cx="4785360" cy="3596640"/>
+                      <a:ext cx="6134100" cy="4122420"/>
                     </a:xfrm>
                     <a:prstGeom prst="rect">
                       <a:avLst/>
@@ -6785,7 +6785,7 @@
         <w:rPr/>
         <w:drawing>
           <wp:inline distT="0" distB="0" distL="0" distR="0">
-            <wp:extent cx="6362700" cy="4107180"/>
+            <wp:extent cx="6477635" cy="4274820"/>
             <wp:effectExtent l="0" t="0" r="0" b="0"/>
             <wp:docPr id="6" name="Image6" descr=""/>
             <wp:cNvGraphicFramePr>
@@ -6809,7 +6809,7 @@
                   <pic:spPr bwMode="auto">
                     <a:xfrm>
                       <a:off x="0" y="0"/>
-                      <a:ext cx="6362700" cy="4107180"/>
+                      <a:ext cx="6477635" cy="4274820"/>
                     </a:xfrm>
                     <a:prstGeom prst="rect">
                       <a:avLst/>
@@ -6844,7 +6844,41 @@
       </w:r>
       <w:r>
         <w:rPr/>
-        <w:t>. end-to-end latency</w:t>
+        <w:t>(</w:t>
+      </w:r>
+      <w:r>
+        <w:rPr>
+          <w:rStyle w:val="StrongEmphasis"/>
+        </w:rPr>
+        <w:t xml:space="preserve">동시성 </w:t>
+      </w:r>
+      <w:r>
+        <w:rPr>
+          <w:rStyle w:val="StrongEmphasis"/>
+        </w:rPr>
+        <w:t xml:space="preserve">1, </w:t>
+      </w:r>
+      <w:r>
+        <w:rPr>
+          <w:rStyle w:val="StrongEmphasis"/>
+        </w:rPr>
+        <w:t xml:space="preserve">경합 없는 순수 </w:t>
+      </w:r>
+      <w:r>
+        <w:rPr>
+          <w:rStyle w:val="StrongEmphasis"/>
+        </w:rPr>
+        <w:t xml:space="preserve">per-request </w:t>
+      </w:r>
+      <w:r>
+        <w:rPr>
+          <w:rStyle w:val="StrongEmphasis"/>
+        </w:rPr>
+        <w:t>분해</w:t>
+      </w:r>
+      <w:r>
+        <w:rPr/>
+        <w:t>). end-to-end latency</w:t>
       </w:r>
       <w:r>
         <w:rPr/>
@@ -7060,7 +7094,7 @@
             </w:pPr>
             <w:r>
               <w:rPr/>
-              <w:t>7.7</w:t>
+              <w:t>6.5</w:t>
             </w:r>
           </w:p>
         </w:tc>
@@ -7081,7 +7115,7 @@
             </w:pPr>
             <w:r>
               <w:rPr/>
-              <w:t>0.5</w:t>
+              <w:t>0.1</w:t>
             </w:r>
           </w:p>
         </w:tc>
@@ -7102,7 +7136,7 @@
             </w:pPr>
             <w:r>
               <w:rPr/>
-              <w:t>5.9</w:t>
+              <w:t>0.7</w:t>
             </w:r>
           </w:p>
         </w:tc>
@@ -7168,7 +7202,7 @@
             </w:pPr>
             <w:r>
               <w:rPr/>
-              <w:t>7.7</w:t>
+              <w:t>6.5</w:t>
             </w:r>
           </w:p>
         </w:tc>
@@ -7189,7 +7223,7 @@
             </w:pPr>
             <w:r>
               <w:rPr/>
-              <w:t>3.8</w:t>
+              <w:t>0.3</w:t>
             </w:r>
           </w:p>
         </w:tc>
@@ -7210,7 +7244,7 @@
             </w:pPr>
             <w:r>
               <w:rPr/>
-              <w:t>19.3</w:t>
+              <w:t>2.0</w:t>
             </w:r>
           </w:p>
         </w:tc>
@@ -7276,7 +7310,7 @@
             </w:pPr>
             <w:r>
               <w:rPr/>
-              <w:t>21.2</w:t>
+              <w:t>6.5</w:t>
             </w:r>
           </w:p>
         </w:tc>
@@ -7297,7 +7331,7 @@
             </w:pPr>
             <w:r>
               <w:rPr/>
-              <w:t>18.7</w:t>
+              <w:t>1.2</w:t>
             </w:r>
           </w:p>
         </w:tc>
@@ -7318,7 +7352,7 @@
             </w:pPr>
             <w:r>
               <w:rPr/>
-              <w:t>46.5</w:t>
+              <w:t>4.1</w:t>
             </w:r>
           </w:p>
         </w:tc>
@@ -7384,7 +7418,7 @@
             </w:pPr>
             <w:r>
               <w:rPr/>
-              <w:t>96.9</w:t>
+              <w:t>7.7</w:t>
             </w:r>
           </w:p>
         </w:tc>
@@ -7405,7 +7439,7 @@
             </w:pPr>
             <w:r>
               <w:rPr/>
-              <w:t>88.6</w:t>
+              <w:t>7.2</w:t>
             </w:r>
           </w:p>
         </w:tc>
@@ -7426,7 +7460,7 @@
             </w:pPr>
             <w:r>
               <w:rPr/>
-              <w:t>162.1</w:t>
+              <w:t>17.6</w:t>
             </w:r>
           </w:p>
         </w:tc>
@@ -7492,7 +7526,7 @@
             </w:pPr>
             <w:r>
               <w:rPr/>
-              <w:t>26.4</w:t>
+              <w:t>9.5</w:t>
             </w:r>
           </w:p>
         </w:tc>
@@ -7513,7 +7547,7 @@
             </w:pPr>
             <w:r>
               <w:rPr/>
-              <w:t>146.4</w:t>
+              <w:t>46.8</w:t>
             </w:r>
           </w:p>
         </w:tc>
@@ -7534,7 +7568,7 @@
             </w:pPr>
             <w:r>
               <w:rPr/>
-              <w:t>192.9</w:t>
+              <w:t>47.9</w:t>
             </w:r>
           </w:p>
         </w:tc>
@@ -7560,17 +7594,103 @@
         <w:rPr>
           <w:rStyle w:val="StrongEmphasis"/>
         </w:rPr>
-        <w:t>Serialization/Network overhead</w:t>
+        <w:t xml:space="preserve">Dispatcher </w:t>
+      </w:r>
+      <w:r>
+        <w:rPr>
+          <w:rStyle w:val="StrongEmphasis"/>
+        </w:rPr>
+        <w:t>배칭 윈도우</w:t>
+      </w:r>
+      <w:r>
+        <w:rPr>
+          <w:rStyle w:val="StrongEmphasis"/>
+        </w:rPr>
+        <w:t>(</w:t>
+      </w:r>
+      <w:r>
+        <w:rPr>
+          <w:rStyle w:val="StrongEmphasis"/>
+        </w:rPr>
+        <w:t>고정 오버헤드</w:t>
+      </w:r>
+      <w:r>
+        <w:rPr>
+          <w:rStyle w:val="StrongEmphasis"/>
+        </w:rPr>
+        <w:t>)</w:t>
+      </w:r>
+      <w:r>
+        <w:rPr/>
+        <w:t>: queue</w:t>
+      </w:r>
+      <w:r>
+        <w:rPr/>
+        <w:t xml:space="preserve">가 페이로드와 무관하게 </w:t>
+      </w:r>
+      <w:r>
+        <w:rPr/>
+        <w:t>~6.5ms</w:t>
+      </w:r>
+      <w:r>
+        <w:rPr/>
+        <w:t xml:space="preserve">로 평탄 </w:t>
+      </w:r>
+      <w:r>
+        <w:rPr/>
+        <w:t>= dispatcher</w:t>
+      </w:r>
+      <w:r>
+        <w:rPr/>
+        <w:t xml:space="preserve">가 단일 요청도 항상 </w:t>
+      </w:r>
+      <w:r>
+        <w:rPr/>
+        <w:t xml:space="preserve">5ms </w:t>
+      </w:r>
+      <w:r>
+        <w:rPr/>
+        <w:t>윈도우를 대기하기 때문</w:t>
+      </w:r>
+      <w:r>
+        <w:rPr/>
+        <w:t xml:space="preserve">. </w:t>
+      </w:r>
+      <w:r>
+        <w:rPr/>
+        <w:t xml:space="preserve">작은 페이로드에서는 이 윈도우가 지배적 </w:t>
+      </w:r>
+      <w:r>
+        <w:rPr/>
+        <w:t xml:space="preserve">latency. → </w:t>
+      </w:r>
+      <w:r>
+        <w:rPr/>
+        <w:t xml:space="preserve">유휴 워커가 있으면 즉시 </w:t>
+      </w:r>
+      <w:r>
+        <w:rPr/>
+        <w:t>flush</w:t>
+      </w:r>
+      <w:r>
+        <w:rPr/>
+        <w:t>하도록 개선 가능</w:t>
+      </w:r>
+      <w:r>
+        <w:rPr/>
+        <w:t xml:space="preserve">. - </w:t>
+      </w:r>
+      <w:r>
+        <w:rPr>
+          <w:rStyle w:val="StrongEmphasis"/>
+        </w:rPr>
+        <w:t>Serialization/Communication overhead</w:t>
       </w:r>
       <w:r>
         <w:rPr/>
         <w:t xml:space="preserve">: </w:t>
       </w:r>
       <w:r>
-        <w:rPr/>
-        <w:t xml:space="preserve">작은 페이로드에서 </w:t>
-      </w:r>
-      <w:r>
         <w:rPr>
           <w:rStyle w:val="SourceText"/>
         </w:rPr>
@@ -7578,203 +7698,1102 @@
       </w:r>
       <w:r>
         <w:rPr/>
-        <w:t>가 지배</w:t>
-      </w:r>
-      <w:r>
-        <w:rPr/>
-        <w:t xml:space="preserve">. protobuf encode/decode + 2-hop TCP + H2D/D2H </w:t>
-      </w:r>
-      <w:r>
-        <w:rPr/>
-        <w:t>복사가 합쳐진 값</w:t>
-      </w:r>
-      <w:r>
-        <w:rPr/>
-        <w:t>. 1MB</w:t>
+        <w:t>는 페이로드에 비례</w:t>
+      </w:r>
+      <w:r>
+        <w:rPr/>
+        <w:t xml:space="preserve">(32KB 0.7ms → 16MB 48ms). protobuf encode/decode + 2-hop TCP + H2D/D2H </w:t>
+      </w:r>
+      <w:r>
+        <w:rPr/>
+        <w:t>복사 합산</w:t>
+      </w:r>
+      <w:r>
+        <w:rPr/>
+        <w:t xml:space="preserve">. - </w:t>
+      </w:r>
+      <w:r>
+        <w:rPr>
+          <w:rStyle w:val="StrongEmphasis"/>
+        </w:rPr>
+        <w:t>GPU bottleneck</w:t>
+      </w:r>
+      <w:r>
+        <w:rPr/>
+        <w:t xml:space="preserve">: </w:t>
+      </w:r>
+      <w:r>
+        <w:rPr/>
+        <w:t xml:space="preserve">큰 페이로드에서 </w:t>
+      </w:r>
+      <w:r>
+        <w:rPr/>
+        <w:t xml:space="preserve">compute </w:t>
+      </w:r>
+      <w:r>
+        <w:rPr/>
+        <w:t>급증</w:t>
+      </w:r>
+      <w:r>
+        <w:rPr/>
+        <w:t>(16MB 46.8ms)</w:t>
+      </w:r>
+      <w:r>
+        <w:rPr/>
+        <w:t xml:space="preserve">하여 </w:t>
+      </w:r>
+      <w:r>
+        <w:rPr>
+          <w:rStyle w:val="StrongEmphasis"/>
+        </w:rPr>
+        <w:t xml:space="preserve">window/transport-bound → compute-bound </w:t>
+      </w:r>
+      <w:r>
+        <w:rPr>
+          <w:rStyle w:val="StrongEmphasis"/>
+        </w:rPr>
+        <w:t>크로스오버</w:t>
+      </w:r>
+      <w:r>
+        <w:rPr/>
+        <w:t xml:space="preserve">. - </w:t>
+      </w:r>
+      <w:r>
+        <w:rPr>
+          <w:rStyle w:val="StrongEmphasis"/>
+        </w:rPr>
+        <w:t>Queue contention(</w:t>
+      </w:r>
+      <w:r>
+        <w:rPr>
+          <w:rStyle w:val="StrongEmphasis"/>
+        </w:rPr>
+        <w:t>고동시성 시</w:t>
+      </w:r>
+      <w:r>
+        <w:rPr>
+          <w:rStyle w:val="StrongEmphasis"/>
+        </w:rPr>
+        <w:t>)</w:t>
+      </w:r>
+      <w:r>
+        <w:rPr/>
+        <w:t xml:space="preserve">: </w:t>
+      </w:r>
+      <w:r>
+        <w:rPr/>
+        <w:t xml:space="preserve">단일 워커를 </w:t>
+      </w:r>
+      <w:r>
+        <w:rPr/>
+        <w:t>mutex</w:t>
+      </w:r>
+      <w:r>
+        <w:rPr/>
+        <w:t xml:space="preserve">로 직렬화하므로 동시성↑ 시 이전 배치 대기로 </w:t>
+      </w:r>
+      <w:r>
+        <w:rPr/>
+        <w:t>queue</w:t>
+      </w:r>
+      <w:r>
+        <w:rPr/>
+        <w:t>가 추가 증가</w:t>
+      </w:r>
+      <w:r>
+        <w:rPr/>
+        <w:t xml:space="preserve">. </w:t>
+      </w:r>
+      <w:r>
+        <w:rPr/>
+        <w:t xml:space="preserve">워커 스케일링이 </w:t>
+      </w:r>
+      <w:r>
+        <w:rPr/>
+        <w:t>sub-linear</w:t>
+      </w:r>
+      <w:r>
+        <w:rPr/>
+        <w:t>한 근본 원인</w:t>
+      </w:r>
+      <w:r>
+        <w:rPr/>
+        <w:t>(</w:t>
+      </w:r>
+      <w:r>
+        <w:rPr/>
+        <w:t xml:space="preserve">단일 </w:t>
+      </w:r>
+      <w:r>
+        <w:rPr/>
+        <w:t xml:space="preserve">GPU </w:t>
+      </w:r>
+      <w:r>
+        <w:rPr/>
+        <w:t>공유</w:t>
+      </w:r>
+      <w:r>
+        <w:rPr/>
+        <w:t>, §4.3).</w:t>
+      </w:r>
+    </w:p>
+    <w:p>
+      <w:pPr>
+        <w:pStyle w:val="TextBody"/>
+        <w:bidi w:val="0"/>
+        <w:spacing w:lineRule="auto" w:line="276" w:before="0" w:after="140"/>
+        <w:jc w:val="left"/>
+        <w:rPr/>
+      </w:pPr>
+      <w:r>
+        <w:rPr>
+          <w:rStyle w:val="StrongEmphasis"/>
+        </w:rPr>
+        <w:t xml:space="preserve">검증 — </w:t>
+      </w:r>
+      <w:r>
+        <w:rPr>
+          <w:rStyle w:val="StrongEmphasis"/>
+        </w:rPr>
+        <w:t>queue/communication</w:t>
+      </w:r>
+      <w:r>
+        <w:rPr>
+          <w:rStyle w:val="StrongEmphasis"/>
+        </w:rPr>
+        <w:t>이 큰 것은 버그인가</w:t>
+      </w:r>
+      <w:r>
+        <w:rPr>
+          <w:rStyle w:val="StrongEmphasis"/>
+        </w:rPr>
+        <w:t>? (No)</w:t>
+      </w:r>
+      <w:r>
+        <w:rPr/>
+        <w:t xml:space="preserve"> </w:t>
+      </w:r>
+      <w:r>
+        <w:rPr/>
+        <w:t xml:space="preserve">동일 </w:t>
+      </w:r>
+      <w:r>
+        <w:rPr/>
+        <w:t xml:space="preserve">1MB </w:t>
+      </w:r>
+      <w:r>
+        <w:rPr/>
+        <w:t xml:space="preserve">요청을 </w:t>
+      </w:r>
+      <w:r>
+        <w:rPr/>
+        <w:t>3</w:t>
+      </w:r>
+      <w:r>
+        <w:rPr/>
+        <w:t>가지 조건으로 통제 측정</w:t>
+      </w:r>
+      <w:r>
+        <w:rPr/>
+        <w:t>:</w:t>
+      </w:r>
+    </w:p>
+    <w:tbl>
+      <w:tblPr>
+        <w:tblW w:w="6350" w:type="dxa"/>
+        <w:jc w:val="left"/>
+        <w:tblInd w:w="0" w:type="dxa"/>
+        <w:tblLayout w:type="fixed"/>
+        <w:tblCellMar>
+          <w:top w:w="28" w:type="dxa"/>
+          <w:left w:w="28" w:type="dxa"/>
+          <w:bottom w:w="28" w:type="dxa"/>
+          <w:right w:w="28" w:type="dxa"/>
+        </w:tblCellMar>
+      </w:tblPr>
+      <w:tblGrid>
+        <w:gridCol w:w="2731"/>
+        <w:gridCol w:w="751"/>
+        <w:gridCol w:w="646"/>
+        <w:gridCol w:w="886"/>
+        <w:gridCol w:w="1336"/>
+      </w:tblGrid>
+      <w:tr>
+        <w:trPr>
+          <w:tblHeader w:val="true"/>
+        </w:trPr>
+        <w:tc>
+          <w:tcPr>
+            <w:tcW w:w="2731" w:type="dxa"/>
+            <w:tcBorders/>
+            <w:vAlign w:val="center"/>
+          </w:tcPr>
+          <w:p>
+            <w:pPr>
+              <w:pStyle w:val="TableHeading"/>
+              <w:suppressLineNumbers/>
+              <w:shd w:fill="EEF2FA" w:val="clear"/>
+              <w:bidi w:val="0"/>
+              <w:jc w:val="center"/>
+              <w:rPr/>
+            </w:pPr>
+            <w:r>
+              <w:rPr/>
+              <w:t>시나리오</w:t>
+            </w:r>
+          </w:p>
+        </w:tc>
+        <w:tc>
+          <w:tcPr>
+            <w:tcW w:w="751" w:type="dxa"/>
+            <w:tcBorders/>
+            <w:vAlign w:val="center"/>
+          </w:tcPr>
+          <w:p>
+            <w:pPr>
+              <w:pStyle w:val="TableHeading"/>
+              <w:suppressLineNumbers/>
+              <w:shd w:fill="EEF2FA" w:val="clear"/>
+              <w:bidi w:val="0"/>
+              <w:jc w:val="center"/>
+              <w:rPr/>
+            </w:pPr>
+            <w:r>
+              <w:rPr/>
+              <w:t>latency</w:t>
+            </w:r>
+          </w:p>
+        </w:tc>
+        <w:tc>
+          <w:tcPr>
+            <w:tcW w:w="646" w:type="dxa"/>
+            <w:tcBorders/>
+            <w:vAlign w:val="center"/>
+          </w:tcPr>
+          <w:p>
+            <w:pPr>
+              <w:pStyle w:val="TableHeading"/>
+              <w:suppressLineNumbers/>
+              <w:shd w:fill="EEF2FA" w:val="clear"/>
+              <w:bidi w:val="0"/>
+              <w:jc w:val="center"/>
+              <w:rPr/>
+            </w:pPr>
+            <w:r>
+              <w:rPr/>
+              <w:t>queue</w:t>
+            </w:r>
+          </w:p>
+        </w:tc>
+        <w:tc>
+          <w:tcPr>
+            <w:tcW w:w="886" w:type="dxa"/>
+            <w:tcBorders/>
+            <w:vAlign w:val="center"/>
+          </w:tcPr>
+          <w:p>
+            <w:pPr>
+              <w:pStyle w:val="TableHeading"/>
+              <w:suppressLineNumbers/>
+              <w:shd w:fill="EEF2FA" w:val="clear"/>
+              <w:bidi w:val="0"/>
+              <w:jc w:val="center"/>
+              <w:rPr/>
+            </w:pPr>
+            <w:r>
+              <w:rPr/>
+              <w:t>compute</w:t>
+            </w:r>
+          </w:p>
+        </w:tc>
+        <w:tc>
+          <w:tcPr>
+            <w:tcW w:w="1336" w:type="dxa"/>
+            <w:tcBorders/>
+            <w:vAlign w:val="center"/>
+          </w:tcPr>
+          <w:p>
+            <w:pPr>
+              <w:pStyle w:val="TableHeading"/>
+              <w:suppressLineNumbers/>
+              <w:shd w:fill="EEF2FA" w:val="clear"/>
+              <w:bidi w:val="0"/>
+              <w:jc w:val="center"/>
+              <w:rPr/>
+            </w:pPr>
+            <w:r>
+              <w:rPr/>
+              <w:t>other(comm)</w:t>
+            </w:r>
+          </w:p>
+        </w:tc>
+      </w:tr>
+      <w:tr>
+        <w:trPr/>
+        <w:tc>
+          <w:tcPr>
+            <w:tcW w:w="2731" w:type="dxa"/>
+            <w:tcBorders/>
+            <w:vAlign w:val="center"/>
+          </w:tcPr>
+          <w:p>
+            <w:pPr>
+              <w:pStyle w:val="TableContents"/>
+              <w:widowControl w:val="false"/>
+              <w:suppressLineNumbers/>
+              <w:bidi w:val="0"/>
+              <w:jc w:val="left"/>
+              <w:rPr/>
+            </w:pPr>
+            <w:r>
+              <w:rPr/>
+              <w:t xml:space="preserve">A. </w:t>
+            </w:r>
+            <w:r>
+              <w:rPr/>
+              <w:t>워커 직접 호출</w:t>
+            </w:r>
+            <w:r>
+              <w:rPr/>
+              <w:t xml:space="preserve">, </w:t>
+            </w:r>
+            <w:r>
+              <w:rPr/>
+              <w:t xml:space="preserve">동시성 </w:t>
+            </w:r>
+            <w:r>
+              <w:rPr/>
+              <w:t>1</w:t>
+            </w:r>
+          </w:p>
+        </w:tc>
+        <w:tc>
+          <w:tcPr>
+            <w:tcW w:w="751" w:type="dxa"/>
+            <w:tcBorders/>
+            <w:vAlign w:val="center"/>
+          </w:tcPr>
+          <w:p>
+            <w:pPr>
+              <w:pStyle w:val="TableContents"/>
+              <w:widowControl w:val="false"/>
+              <w:suppressLineNumbers/>
+              <w:bidi w:val="0"/>
+              <w:jc w:val="left"/>
+              <w:rPr/>
+            </w:pPr>
+            <w:r>
+              <w:rPr/>
+              <w:t>2.1</w:t>
+            </w:r>
+          </w:p>
+        </w:tc>
+        <w:tc>
+          <w:tcPr>
+            <w:tcW w:w="646" w:type="dxa"/>
+            <w:tcBorders/>
+            <w:vAlign w:val="center"/>
+          </w:tcPr>
+          <w:p>
+            <w:pPr>
+              <w:pStyle w:val="TableContents"/>
+              <w:widowControl w:val="false"/>
+              <w:suppressLineNumbers/>
+              <w:bidi w:val="0"/>
+              <w:jc w:val="left"/>
+              <w:rPr/>
+            </w:pPr>
+            <w:r>
+              <w:rPr/>
+              <w:t>0.0</w:t>
+            </w:r>
+          </w:p>
+        </w:tc>
+        <w:tc>
+          <w:tcPr>
+            <w:tcW w:w="886" w:type="dxa"/>
+            <w:tcBorders/>
+            <w:vAlign w:val="center"/>
+          </w:tcPr>
+          <w:p>
+            <w:pPr>
+              <w:pStyle w:val="TableContents"/>
+              <w:widowControl w:val="false"/>
+              <w:suppressLineNumbers/>
+              <w:bidi w:val="0"/>
+              <w:jc w:val="left"/>
+              <w:rPr/>
+            </w:pPr>
+            <w:r>
+              <w:rPr/>
+              <w:t>1.2</w:t>
+            </w:r>
+          </w:p>
+        </w:tc>
+        <w:tc>
+          <w:tcPr>
+            <w:tcW w:w="1336" w:type="dxa"/>
+            <w:tcBorders/>
+            <w:vAlign w:val="center"/>
+          </w:tcPr>
+          <w:p>
+            <w:pPr>
+              <w:pStyle w:val="TableContents"/>
+              <w:widowControl w:val="false"/>
+              <w:suppressLineNumbers/>
+              <w:bidi w:val="0"/>
+              <w:jc w:val="left"/>
+              <w:rPr/>
+            </w:pPr>
+            <w:r>
+              <w:rPr>
+                <w:rStyle w:val="StrongEmphasis"/>
+              </w:rPr>
+              <w:t>0.9</w:t>
+            </w:r>
+          </w:p>
+        </w:tc>
+      </w:tr>
+      <w:tr>
+        <w:trPr/>
+        <w:tc>
+          <w:tcPr>
+            <w:tcW w:w="2731" w:type="dxa"/>
+            <w:tcBorders/>
+            <w:vAlign w:val="center"/>
+          </w:tcPr>
+          <w:p>
+            <w:pPr>
+              <w:pStyle w:val="TableContents"/>
+              <w:widowControl w:val="false"/>
+              <w:suppressLineNumbers/>
+              <w:bidi w:val="0"/>
+              <w:jc w:val="left"/>
+              <w:rPr/>
+            </w:pPr>
+            <w:r>
+              <w:rPr/>
+              <w:t xml:space="preserve">B. dispatcher </w:t>
+            </w:r>
+            <w:r>
+              <w:rPr/>
+              <w:t>경유</w:t>
+            </w:r>
+            <w:r>
+              <w:rPr/>
+              <w:t xml:space="preserve">, </w:t>
+            </w:r>
+            <w:r>
+              <w:rPr/>
+              <w:t xml:space="preserve">동시성 </w:t>
+            </w:r>
+            <w:r>
+              <w:rPr/>
+              <w:t>1</w:t>
+            </w:r>
+          </w:p>
+        </w:tc>
+        <w:tc>
+          <w:tcPr>
+            <w:tcW w:w="751" w:type="dxa"/>
+            <w:tcBorders/>
+            <w:vAlign w:val="center"/>
+          </w:tcPr>
+          <w:p>
+            <w:pPr>
+              <w:pStyle w:val="TableContents"/>
+              <w:widowControl w:val="false"/>
+              <w:suppressLineNumbers/>
+              <w:bidi w:val="0"/>
+              <w:jc w:val="left"/>
+              <w:rPr/>
+            </w:pPr>
+            <w:r>
+              <w:rPr/>
+              <w:t>11.9</w:t>
+            </w:r>
+          </w:p>
+        </w:tc>
+        <w:tc>
+          <w:tcPr>
+            <w:tcW w:w="646" w:type="dxa"/>
+            <w:tcBorders/>
+            <w:vAlign w:val="center"/>
+          </w:tcPr>
+          <w:p>
+            <w:pPr>
+              <w:pStyle w:val="TableContents"/>
+              <w:widowControl w:val="false"/>
+              <w:suppressLineNumbers/>
+              <w:bidi w:val="0"/>
+              <w:jc w:val="left"/>
+              <w:rPr/>
+            </w:pPr>
+            <w:r>
+              <w:rPr/>
+              <w:t>6.5</w:t>
+            </w:r>
+          </w:p>
+        </w:tc>
+        <w:tc>
+          <w:tcPr>
+            <w:tcW w:w="886" w:type="dxa"/>
+            <w:tcBorders/>
+            <w:vAlign w:val="center"/>
+          </w:tcPr>
+          <w:p>
+            <w:pPr>
+              <w:pStyle w:val="TableContents"/>
+              <w:widowControl w:val="false"/>
+              <w:suppressLineNumbers/>
+              <w:bidi w:val="0"/>
+              <w:jc w:val="left"/>
+              <w:rPr/>
+            </w:pPr>
+            <w:r>
+              <w:rPr/>
+              <w:t>1.2</w:t>
+            </w:r>
+          </w:p>
+        </w:tc>
+        <w:tc>
+          <w:tcPr>
+            <w:tcW w:w="1336" w:type="dxa"/>
+            <w:tcBorders/>
+            <w:vAlign w:val="center"/>
+          </w:tcPr>
+          <w:p>
+            <w:pPr>
+              <w:pStyle w:val="TableContents"/>
+              <w:widowControl w:val="false"/>
+              <w:suppressLineNumbers/>
+              <w:bidi w:val="0"/>
+              <w:jc w:val="left"/>
+              <w:rPr/>
+            </w:pPr>
+            <w:r>
+              <w:rPr/>
+              <w:t>4.3</w:t>
+            </w:r>
+          </w:p>
+        </w:tc>
+      </w:tr>
+      <w:tr>
+        <w:trPr/>
+        <w:tc>
+          <w:tcPr>
+            <w:tcW w:w="2731" w:type="dxa"/>
+            <w:tcBorders/>
+            <w:vAlign w:val="center"/>
+          </w:tcPr>
+          <w:p>
+            <w:pPr>
+              <w:pStyle w:val="TableContents"/>
+              <w:widowControl w:val="false"/>
+              <w:suppressLineNumbers/>
+              <w:bidi w:val="0"/>
+              <w:jc w:val="left"/>
+              <w:rPr/>
+            </w:pPr>
+            <w:r>
+              <w:rPr/>
+              <w:t xml:space="preserve">C. dispatcher </w:t>
+            </w:r>
+            <w:r>
+              <w:rPr/>
+              <w:t>경유</w:t>
+            </w:r>
+            <w:r>
+              <w:rPr/>
+              <w:t xml:space="preserve">, </w:t>
+            </w:r>
+            <w:r>
+              <w:rPr/>
+              <w:t xml:space="preserve">동시성 </w:t>
+            </w:r>
+            <w:r>
+              <w:rPr/>
+              <w:t>16</w:t>
+            </w:r>
+          </w:p>
+        </w:tc>
+        <w:tc>
+          <w:tcPr>
+            <w:tcW w:w="751" w:type="dxa"/>
+            <w:tcBorders/>
+            <w:vAlign w:val="center"/>
+          </w:tcPr>
+          <w:p>
+            <w:pPr>
+              <w:pStyle w:val="TableContents"/>
+              <w:widowControl w:val="false"/>
+              <w:suppressLineNumbers/>
+              <w:bidi w:val="0"/>
+              <w:jc w:val="left"/>
+              <w:rPr/>
+            </w:pPr>
+            <w:r>
+              <w:rPr/>
+              <w:t>80.0</w:t>
+            </w:r>
+          </w:p>
+        </w:tc>
+        <w:tc>
+          <w:tcPr>
+            <w:tcW w:w="646" w:type="dxa"/>
+            <w:tcBorders/>
+            <w:vAlign w:val="center"/>
+          </w:tcPr>
+          <w:p>
+            <w:pPr>
+              <w:pStyle w:val="TableContents"/>
+              <w:widowControl w:val="false"/>
+              <w:suppressLineNumbers/>
+              <w:bidi w:val="0"/>
+              <w:jc w:val="left"/>
+              <w:rPr/>
+            </w:pPr>
+            <w:r>
+              <w:rPr/>
+              <w:t>20.8</w:t>
+            </w:r>
+          </w:p>
+        </w:tc>
+        <w:tc>
+          <w:tcPr>
+            <w:tcW w:w="886" w:type="dxa"/>
+            <w:tcBorders/>
+            <w:vAlign w:val="center"/>
+          </w:tcPr>
+          <w:p>
+            <w:pPr>
+              <w:pStyle w:val="TableContents"/>
+              <w:widowControl w:val="false"/>
+              <w:suppressLineNumbers/>
+              <w:bidi w:val="0"/>
+              <w:jc w:val="left"/>
+              <w:rPr/>
+            </w:pPr>
+            <w:r>
+              <w:rPr/>
+              <w:t>17.2</w:t>
+            </w:r>
+          </w:p>
+        </w:tc>
+        <w:tc>
+          <w:tcPr>
+            <w:tcW w:w="1336" w:type="dxa"/>
+            <w:tcBorders/>
+            <w:vAlign w:val="center"/>
+          </w:tcPr>
+          <w:p>
+            <w:pPr>
+              <w:pStyle w:val="TableContents"/>
+              <w:widowControl w:val="false"/>
+              <w:suppressLineNumbers/>
+              <w:bidi w:val="0"/>
+              <w:jc w:val="left"/>
+              <w:rPr/>
+            </w:pPr>
+            <w:r>
+              <w:rPr/>
+              <w:t>42.0</w:t>
+            </w:r>
+          </w:p>
+        </w:tc>
+      </w:tr>
+    </w:tbl>
+    <w:p>
+      <w:pPr>
+        <w:pStyle w:val="TextBody"/>
+        <w:numPr>
+          <w:ilvl w:val="0"/>
+          <w:numId w:val="9"/>
+        </w:numPr>
+        <w:tabs>
+          <w:tab w:val="clear" w:pos="709"/>
+          <w:tab w:val="left" w:pos="709" w:leader="none"/>
+        </w:tabs>
+        <w:bidi w:val="0"/>
+        <w:spacing w:before="0" w:after="0"/>
+        <w:ind w:left="709" w:hanging="283"/>
+        <w:jc w:val="left"/>
+        <w:rPr/>
+      </w:pPr>
+      <w:r>
+        <w:rPr/>
+        <w:t>A</w:t>
       </w:r>
       <w:r>
         <w:rPr/>
         <w:t xml:space="preserve">에서 </w:t>
       </w:r>
       <w:r>
-        <w:rPr/>
-        <w:t>46ms</w:t>
-      </w:r>
-      <w:r>
-        <w:rPr/>
-        <w:t>로 최대 구성요소</w:t>
-      </w:r>
-      <w:r>
-        <w:rPr/>
-        <w:t xml:space="preserve">. - </w:t>
-      </w:r>
-      <w:r>
-        <w:rPr>
-          <w:rStyle w:val="StrongEmphasis"/>
-        </w:rPr>
-        <w:t>GPU bottleneck</w:t>
-      </w:r>
-      <w:r>
-        <w:rPr/>
-        <w:t xml:space="preserve">: </w:t>
-      </w:r>
-      <w:r>
-        <w:rPr/>
-        <w:t xml:space="preserve">큰 페이로드에서 </w:t>
-      </w:r>
-      <w:r>
-        <w:rPr/>
+        <w:rPr>
+          <w:rStyle w:val="StrongEmphasis"/>
+        </w:rPr>
+        <w:t xml:space="preserve">통신 오버헤드는 </w:t>
+      </w:r>
+      <w:r>
+        <w:rPr>
+          <w:rStyle w:val="StrongEmphasis"/>
+        </w:rPr>
+        <w:t>1MB</w:t>
+      </w:r>
+      <w:r>
+        <w:rPr>
+          <w:rStyle w:val="StrongEmphasis"/>
+        </w:rPr>
+        <w:t xml:space="preserve">당 </w:t>
+      </w:r>
+      <w:r>
+        <w:rPr>
+          <w:rStyle w:val="StrongEmphasis"/>
+        </w:rPr>
+        <w:t>0.9ms</w:t>
+      </w:r>
+      <w:r>
+        <w:rPr>
+          <w:rStyle w:val="StrongEmphasis"/>
+        </w:rPr>
+        <w:t>로 매우 작다</w:t>
+      </w:r>
+      <w:r>
+        <w:rPr/>
+        <w:t xml:space="preserve"> → 통신 자체엔 누수</w:t>
+      </w:r>
+      <w:r>
+        <w:rPr/>
+        <w:t>/</w:t>
+      </w:r>
+      <w:r>
+        <w:rPr/>
+        <w:t>버그 없음</w:t>
+      </w:r>
+      <w:r>
+        <w:rPr/>
+        <w:t xml:space="preserve">. </w:t>
+      </w:r>
+    </w:p>
+    <w:p>
+      <w:pPr>
+        <w:pStyle w:val="TextBody"/>
+        <w:numPr>
+          <w:ilvl w:val="0"/>
+          <w:numId w:val="9"/>
+        </w:numPr>
+        <w:tabs>
+          <w:tab w:val="clear" w:pos="709"/>
+          <w:tab w:val="left" w:pos="709" w:leader="none"/>
+        </w:tabs>
+        <w:bidi w:val="0"/>
+        <w:spacing w:before="0" w:after="0"/>
+        <w:ind w:left="709" w:hanging="283"/>
+        <w:jc w:val="left"/>
+        <w:rPr/>
+      </w:pPr>
+      <w:r>
+        <w:rPr/>
+        <w:t>B</w:t>
+      </w:r>
+      <w:r>
+        <w:rPr/>
+        <w:t xml:space="preserve">의 </w:t>
+      </w:r>
+      <w:r>
+        <w:rPr/>
+        <w:t>queue 6.5ms</w:t>
+      </w:r>
+      <w:r>
+        <w:rPr/>
+        <w:t xml:space="preserve">는 </w:t>
+      </w:r>
+      <w:r>
+        <w:rPr/>
+        <w:t xml:space="preserve">5ms </w:t>
+      </w:r>
+      <w:r>
+        <w:rPr/>
+        <w:t>배칭 윈도우</w:t>
+      </w:r>
+      <w:r>
+        <w:rPr/>
+        <w:t>(</w:t>
+      </w:r>
+      <w:r>
+        <w:rPr/>
+        <w:t>고정</w:t>
+      </w:r>
+      <w:r>
+        <w:rPr/>
+        <w:t>), other 4.3ms</w:t>
+      </w:r>
+      <w:r>
+        <w:rPr/>
+        <w:t xml:space="preserve">는 </w:t>
+      </w:r>
+      <w:r>
+        <w:rPr/>
+        <w:t>2-hop(1MB×</w:t>
+      </w:r>
+      <w:r>
+        <w:rPr/>
+        <w:t>왕복</w:t>
+      </w:r>
+      <w:r>
+        <w:rPr/>
+        <w:t xml:space="preserve">) </w:t>
+      </w:r>
+      <w:r>
+        <w:rPr/>
+        <w:t>추가 비용</w:t>
+      </w:r>
+      <w:r>
+        <w:rPr/>
+        <w:t xml:space="preserve">. </w:t>
+      </w:r>
+    </w:p>
+    <w:p>
+      <w:pPr>
+        <w:pStyle w:val="TextBody"/>
+        <w:numPr>
+          <w:ilvl w:val="0"/>
+          <w:numId w:val="9"/>
+        </w:numPr>
+        <w:tabs>
+          <w:tab w:val="clear" w:pos="709"/>
+          <w:tab w:val="left" w:pos="709" w:leader="none"/>
+        </w:tabs>
+        <w:bidi w:val="0"/>
+        <w:ind w:left="709" w:hanging="283"/>
+        <w:jc w:val="left"/>
+        <w:rPr/>
+      </w:pPr>
+      <w:r>
+        <w:rPr/>
+        <w:t>C</w:t>
+      </w:r>
+      <w:r>
+        <w:rPr/>
+        <w:t xml:space="preserve">의 큰 값은 </w:t>
+      </w:r>
+      <w:r>
+        <w:rPr>
+          <w:rStyle w:val="StrongEmphasis"/>
+        </w:rPr>
+        <w:t xml:space="preserve">배칭이 </w:t>
+      </w:r>
+      <w:r>
+        <w:rPr>
+          <w:rStyle w:val="StrongEmphasis"/>
+        </w:rPr>
+        <w:t>16×1MB</w:t>
+      </w:r>
+      <w:r>
+        <w:rPr>
+          <w:rStyle w:val="StrongEmphasis"/>
+        </w:rPr>
+        <w:t xml:space="preserve">를 하나의 </w:t>
+      </w:r>
+      <w:r>
+        <w:rPr>
+          <w:rStyle w:val="StrongEmphasis"/>
+        </w:rPr>
+        <w:t xml:space="preserve">16MB </w:t>
+      </w:r>
+      <w:r>
+        <w:rPr>
+          <w:rStyle w:val="StrongEmphasis"/>
+        </w:rPr>
+        <w:t>워커 호출로 병합</w:t>
+      </w:r>
+      <w:r>
+        <w:rPr/>
+        <w:t xml:space="preserve">한 결과 — 각 요청의 </w:t>
+      </w:r>
+      <w:r>
+        <w:rPr>
+          <w:rStyle w:val="SourceText"/>
+        </w:rPr>
         <w:t>compute</w:t>
       </w:r>
       <w:r>
         <w:rPr/>
-        <w:t>가 급증</w:t>
-      </w:r>
-      <w:r>
-        <w:rPr/>
-        <w:t>(16MB</w:t>
-      </w:r>
-      <w:r>
-        <w:rPr/>
-        <w:t xml:space="preserve">에서 </w:t>
-      </w:r>
-      <w:r>
-        <w:rPr/>
-        <w:t>146ms)</w:t>
-      </w:r>
-      <w:r>
-        <w:rPr/>
-        <w:t xml:space="preserve">하여 </w:t>
-      </w:r>
-      <w:r>
-        <w:rPr>
-          <w:rStyle w:val="StrongEmphasis"/>
-        </w:rPr>
-        <w:t xml:space="preserve">transport-bound → compute-bound </w:t>
-      </w:r>
-      <w:r>
-        <w:rPr>
-          <w:rStyle w:val="StrongEmphasis"/>
-        </w:rPr>
-        <w:t>크로스오버</w:t>
-      </w:r>
-      <w:r>
-        <w:rPr/>
-        <w:t xml:space="preserve"> 발생</w:t>
-      </w:r>
-      <w:r>
-        <w:rPr/>
-        <w:t xml:space="preserve">. - </w:t>
-      </w:r>
-      <w:r>
-        <w:rPr>
-          <w:rStyle w:val="StrongEmphasis"/>
-        </w:rPr>
-        <w:t>Queue contention / Synchronization overhead</w:t>
-      </w:r>
-      <w:r>
-        <w:rPr/>
-        <w:t xml:space="preserve">: </w:t>
-      </w:r>
-      <w:r>
-        <w:rPr/>
-        <w:t xml:space="preserve">워커 단일 </w:t>
-      </w:r>
-      <w:r>
-        <w:rPr/>
-        <w:t>stream</w:t>
-      </w:r>
-      <w:r>
-        <w:rPr/>
-        <w:t xml:space="preserve">을 </w:t>
-      </w:r>
-      <w:r>
-        <w:rPr/>
-        <w:t>mutex</w:t>
-      </w:r>
-      <w:r>
-        <w:rPr/>
-        <w:t xml:space="preserve">로 직렬화하므로 동시 요청이 워커에서 대기 → </w:t>
-      </w:r>
-      <w:r>
-        <w:rPr>
-          <w:rStyle w:val="SourceText"/>
-        </w:rPr>
-        <w:t>queue_ms</w:t>
-      </w:r>
-      <w:r>
-        <w:rPr/>
-        <w:t xml:space="preserve"> </w:t>
-      </w:r>
-      <w:r>
-        <w:rPr/>
-        <w:t>증가</w:t>
-      </w:r>
-      <w:r>
-        <w:rPr/>
-        <w:t>(4MB</w:t>
-      </w:r>
-      <w:r>
-        <w:rPr/>
-        <w:t xml:space="preserve">에서 </w:t>
-      </w:r>
-      <w:r>
-        <w:rPr/>
-        <w:t xml:space="preserve">97ms). </w:t>
-      </w:r>
-      <w:r>
-        <w:rPr/>
-        <w:t xml:space="preserve">워커 스케일링이 </w:t>
-      </w:r>
-      <w:r>
-        <w:rPr/>
-        <w:t>sub-linear</w:t>
-      </w:r>
-      <w:r>
-        <w:rPr/>
-        <w:t>한 근본 원인</w:t>
-      </w:r>
-      <w:r>
-        <w:rPr/>
-        <w:t>(</w:t>
-      </w:r>
-      <w:r>
-        <w:rPr/>
-        <w:t xml:space="preserve">단일 </w:t>
-      </w:r>
-      <w:r>
-        <w:rPr/>
-        <w:t xml:space="preserve">GPU </w:t>
-      </w:r>
-      <w:r>
-        <w:rPr/>
-        <w:t>공유</w:t>
-      </w:r>
-      <w:r>
-        <w:rPr/>
-        <w:t xml:space="preserve">). - </w:t>
-      </w:r>
-      <w:r>
-        <w:rPr>
-          <w:rStyle w:val="StrongEmphasis"/>
-        </w:rPr>
-        <w:t>CPU</w:t>
-      </w:r>
-      <w:r>
-        <w:rPr/>
-        <w:t>: OpenMP gather/scatter</w:t>
-      </w:r>
-      <w:r>
-        <w:rPr/>
-        <w:t xml:space="preserve">는 </w:t>
-      </w:r>
-      <w:r>
-        <w:rPr/>
-        <w:t xml:space="preserve">memcpy </w:t>
-      </w:r>
-      <w:r>
-        <w:rPr/>
-        <w:t>바운드이나 전체 대비 작아 주 병목 아님</w:t>
+        <w:t>/</w:t>
+      </w:r>
+      <w:r>
+        <w:rPr>
+          <w:rStyle w:val="SourceText"/>
+        </w:rPr>
+        <w:t>other</w:t>
+      </w:r>
+      <w:r>
+        <w:rPr/>
+        <w:t xml:space="preserve">가 </w:t>
+      </w:r>
+      <w:r>
+        <w:rPr>
+          <w:rStyle w:val="Emphasis"/>
+        </w:rPr>
+        <w:t>병합 배치 전체</w:t>
+      </w:r>
+      <w:r>
+        <w:rPr/>
+        <w:t>의 연산</w:t>
+      </w:r>
+      <w:r>
+        <w:rPr/>
+        <w:t>/</w:t>
+      </w:r>
+      <w:r>
+        <w:rPr/>
+        <w:t>통신을 반영</w:t>
+      </w:r>
+      <w:r>
+        <w:rPr/>
+        <w:t>(compute 17ms = batch 128</w:t>
+      </w:r>
+      <w:r>
+        <w:rPr/>
+        <w:t xml:space="preserve">의 </w:t>
+      </w:r>
+      <w:r>
+        <w:rPr/>
+        <w:t xml:space="preserve">forward, other 42ms = 16MB </w:t>
+      </w:r>
+      <w:r>
+        <w:rPr/>
+        <w:t>직렬화</w:t>
+      </w:r>
+      <w:r>
+        <w:rPr/>
+        <w:t>/</w:t>
+      </w:r>
+      <w:r>
+        <w:rPr/>
+        <w:t>전송</w:t>
+      </w:r>
+      <w:r>
+        <w:rPr/>
+        <w:t>/</w:t>
+      </w:r>
+      <w:r>
+        <w:rPr/>
+        <w:t>복사</w:t>
+      </w:r>
+      <w:r>
+        <w:rPr/>
+        <w:t>). queue+compute+other=latency</w:t>
+      </w:r>
+      <w:r>
+        <w:rPr/>
+        <w:t>로 내부 일관</w:t>
+      </w:r>
+      <w:r>
+        <w:rPr/>
+        <w:t xml:space="preserve">. </w:t>
+      </w:r>
+    </w:p>
+    <w:p>
+      <w:pPr>
+        <w:pStyle w:val="TextBody"/>
+        <w:bidi w:val="0"/>
+        <w:jc w:val="left"/>
+        <w:rPr/>
+      </w:pPr>
+      <w:r>
+        <w:rPr/>
+        <w:t xml:space="preserve">즉 큰 </w:t>
+      </w:r>
+      <w:r>
+        <w:rPr/>
+        <w:t>queue/communication</w:t>
+      </w:r>
+      <w:r>
+        <w:rPr/>
+        <w:t xml:space="preserve">은 </w:t>
+      </w:r>
+      <w:r>
+        <w:rPr>
+          <w:rStyle w:val="StrongEmphasis"/>
+        </w:rPr>
+        <w:t>포화</w:t>
+      </w:r>
+      <w:r>
+        <w:rPr>
+          <w:rStyle w:val="StrongEmphasis"/>
+        </w:rPr>
+        <w:t>·</w:t>
+      </w:r>
+      <w:r>
+        <w:rPr>
+          <w:rStyle w:val="StrongEmphasis"/>
+        </w:rPr>
+        <w:t>고동시성</w:t>
+      </w:r>
+      <w:r>
+        <w:rPr>
+          <w:rStyle w:val="StrongEmphasis"/>
+        </w:rPr>
+        <w:t>·</w:t>
+      </w:r>
+      <w:r>
+        <w:rPr>
+          <w:rStyle w:val="StrongEmphasis"/>
+        </w:rPr>
+        <w:t>배칭 상태의 정상적 결과</w:t>
+      </w:r>
+      <w:r>
+        <w:rPr/>
+        <w:t>이며 측정 오류가 아니다</w:t>
+      </w:r>
+      <w:r>
+        <w:rPr/>
+        <w:t xml:space="preserve">. </w:t>
+      </w:r>
+      <w:r>
+        <w:rPr/>
+        <w:t xml:space="preserve">위 </w:t>
+      </w:r>
+      <w:r>
+        <w:rPr/>
+        <w:t xml:space="preserve">breakdown </w:t>
+      </w:r>
+      <w:r>
+        <w:rPr/>
+        <w:t xml:space="preserve">차트는 혼동을 피하기 위해 </w:t>
+      </w:r>
+      <w:r>
+        <w:rPr>
+          <w:rStyle w:val="StrongEmphasis"/>
+        </w:rPr>
+        <w:t xml:space="preserve">동시성 </w:t>
+      </w:r>
+      <w:r>
+        <w:rPr>
+          <w:rStyle w:val="StrongEmphasis"/>
+        </w:rPr>
+        <w:t>1</w:t>
+      </w:r>
+      <w:r>
+        <w:rPr/>
+        <w:t>로 측정해 고정 윈도우</w:t>
+      </w:r>
+      <w:r>
+        <w:rPr/>
+        <w:t>·</w:t>
+      </w:r>
+      <w:r>
+        <w:rPr/>
+        <w:t>순수 통신</w:t>
+      </w:r>
+      <w:r>
+        <w:rPr/>
+        <w:t>·</w:t>
+      </w:r>
+      <w:r>
+        <w:rPr/>
+        <w:t>연산을 분리해 보여준다</w:t>
       </w:r>
       <w:r>
         <w:rPr/>
@@ -7806,7 +8825,7 @@
       </w:r>
       <w:r>
         <w:rPr/>
-        <w:t xml:space="preserve">는 직접 계측이 아니라 </w:t>
+        <w:t xml:space="preserve">는 </w:t>
       </w:r>
       <w:r>
         <w:rPr>
@@ -7816,7 +8835,11 @@
       </w:r>
       <w:r>
         <w:rPr/>
-        <w:t>의 잔여값이라 직렬화</w:t>
+        <w:t xml:space="preserve"> </w:t>
+      </w:r>
+      <w:r>
+        <w:rPr/>
+        <w:t>잔여값으로 직렬화</w:t>
       </w:r>
       <w:r>
         <w:rPr/>
@@ -7828,27 +8851,19 @@
       </w:r>
       <w:r>
         <w:rPr/>
-        <w:t>/</w:t>
-      </w:r>
-      <w:r>
-        <w:rPr/>
-        <w:t>복사가 합산되어 있다</w:t>
-      </w:r>
-      <w:r>
-        <w:rPr/>
-        <w:t xml:space="preserve">. 4-way </w:t>
-      </w:r>
-      <w:r>
-        <w:rPr/>
-        <w:t>정밀 분해</w:t>
-      </w:r>
-      <w:r>
-        <w:rPr/>
-        <w:t xml:space="preserve">(H2D/D2H </w:t>
-      </w:r>
-      <w:r>
-        <w:rPr/>
-        <w:t xml:space="preserve">별도 </w:t>
+        <w:t>/H2D·D2H</w:t>
+      </w:r>
+      <w:r>
+        <w:rPr/>
+        <w:t>가 합산돼 있다</w:t>
+      </w:r>
+      <w:r>
+        <w:rPr/>
+        <w:t>. H2D/D2H</w:t>
+      </w:r>
+      <w:r>
+        <w:rPr/>
+        <w:t xml:space="preserve">를 별도 </w:t>
       </w:r>
       <w:r>
         <w:rPr>
@@ -7858,19 +8873,19 @@
       </w:r>
       <w:r>
         <w:rPr/>
-        <w:t xml:space="preserve"> + proto </w:t>
-      </w:r>
-      <w:r>
-        <w:rPr/>
-        <w:t>필드</w:t>
-      </w:r>
-      <w:r>
-        <w:rPr/>
-        <w:t>)</w:t>
-      </w:r>
-      <w:r>
-        <w:rPr/>
-        <w:t>는 향후 과제</w:t>
+        <w:t xml:space="preserve">+proto </w:t>
+      </w:r>
+      <w:r>
+        <w:rPr/>
+        <w:t xml:space="preserve">필드로 분리하는 </w:t>
+      </w:r>
+      <w:r>
+        <w:rPr/>
+        <w:t xml:space="preserve">4-way </w:t>
+      </w:r>
+      <w:r>
+        <w:rPr/>
+        <w:t>정밀 분해는 향후 과제</w:t>
       </w:r>
       <w:r>
         <w:rPr/>
@@ -8271,7 +9286,7 @@
         <w:pStyle w:val="TextBody"/>
         <w:numPr>
           <w:ilvl w:val="0"/>
-          <w:numId w:val="9"/>
+          <w:numId w:val="10"/>
         </w:numPr>
         <w:tabs>
           <w:tab w:val="clear" w:pos="709"/>
@@ -8328,219 +9343,6 @@
       <w:r>
         <w:rPr/>
         <w:t xml:space="preserve"> </w:t>
-      </w:r>
-    </w:p>
-    <w:p>
-      <w:pPr>
-        <w:pStyle w:val="TextBody"/>
-        <w:numPr>
-          <w:ilvl w:val="0"/>
-          <w:numId w:val="9"/>
-        </w:numPr>
-        <w:tabs>
-          <w:tab w:val="clear" w:pos="709"/>
-          <w:tab w:val="left" w:pos="709" w:leader="none"/>
-        </w:tabs>
-        <w:bidi w:val="0"/>
-        <w:spacing w:before="0" w:after="0"/>
-        <w:ind w:left="709" w:hanging="283"/>
-        <w:jc w:val="left"/>
-        <w:rPr/>
-      </w:pPr>
-      <w:r>
-        <w:rPr/>
-        <w:t>빌드</w:t>
-      </w:r>
-      <w:r>
-        <w:rPr/>
-        <w:t xml:space="preserve">: </w:t>
-      </w:r>
-      <w:r>
-        <w:rPr>
-          <w:rStyle w:val="SourceText"/>
-        </w:rPr>
-        <w:t>CMakeLists.txt</w:t>
-      </w:r>
-      <w:r>
-        <w:rPr/>
-        <w:t xml:space="preserve">, </w:t>
-      </w:r>
-      <w:r>
-        <w:rPr>
-          <w:rStyle w:val="SourceText"/>
-        </w:rPr>
-        <w:t>docker/Dockerfile</w:t>
-      </w:r>
-      <w:r>
-        <w:rPr/>
-        <w:t>+</w:t>
-      </w:r>
-      <w:r>
-        <w:rPr>
-          <w:rStyle w:val="SourceText"/>
-        </w:rPr>
-        <w:t>docker-compose.yml</w:t>
-      </w:r>
-      <w:r>
-        <w:rPr/>
-        <w:t xml:space="preserve"> </w:t>
-      </w:r>
-    </w:p>
-    <w:p>
-      <w:pPr>
-        <w:pStyle w:val="TextBody"/>
-        <w:numPr>
-          <w:ilvl w:val="0"/>
-          <w:numId w:val="9"/>
-        </w:numPr>
-        <w:tabs>
-          <w:tab w:val="clear" w:pos="709"/>
-          <w:tab w:val="left" w:pos="709" w:leader="none"/>
-        </w:tabs>
-        <w:bidi w:val="0"/>
-        <w:spacing w:before="0" w:after="0"/>
-        <w:ind w:left="709" w:hanging="283"/>
-        <w:jc w:val="left"/>
-        <w:rPr/>
-      </w:pPr>
-      <w:r>
-        <w:rPr/>
-        <w:t>테스트</w:t>
-      </w:r>
-      <w:r>
-        <w:rPr/>
-        <w:t xml:space="preserve">: </w:t>
-      </w:r>
-      <w:r>
-        <w:rPr>
-          <w:rStyle w:val="SourceText"/>
-        </w:rPr>
-        <w:t>tests/</w:t>
-      </w:r>
-      <w:r>
-        <w:rPr/>
-        <w:t xml:space="preserve">, </w:t>
-      </w:r>
-      <w:r>
-        <w:rPr/>
-        <w:t>스크립트</w:t>
-      </w:r>
-      <w:r>
-        <w:rPr/>
-        <w:t xml:space="preserve">: </w:t>
-      </w:r>
-      <w:r>
-        <w:rPr>
-          <w:rStyle w:val="SourceText"/>
-        </w:rPr>
-        <w:t>scripts/</w:t>
-      </w:r>
-      <w:r>
-        <w:rPr/>
-        <w:t xml:space="preserve"> </w:t>
-      </w:r>
-    </w:p>
-    <w:p>
-      <w:pPr>
-        <w:pStyle w:val="TextBody"/>
-        <w:numPr>
-          <w:ilvl w:val="0"/>
-          <w:numId w:val="9"/>
-        </w:numPr>
-        <w:tabs>
-          <w:tab w:val="clear" w:pos="709"/>
-          <w:tab w:val="left" w:pos="709" w:leader="none"/>
-        </w:tabs>
-        <w:bidi w:val="0"/>
-        <w:ind w:left="709" w:hanging="283"/>
-        <w:jc w:val="left"/>
-        <w:rPr/>
-      </w:pPr>
-      <w:r>
-        <w:rPr>
-          <w:rStyle w:val="SourceText"/>
-        </w:rPr>
-        <w:t>README.md</w:t>
-      </w:r>
-      <w:r>
-        <w:rPr/>
-        <w:t>(</w:t>
-      </w:r>
-      <w:r>
-        <w:rPr/>
-        <w:t>빌드</w:t>
-      </w:r>
-      <w:r>
-        <w:rPr/>
-        <w:t>/</w:t>
-      </w:r>
-      <w:r>
-        <w:rPr/>
-        <w:t>실행</w:t>
-      </w:r>
-      <w:r>
-        <w:rPr/>
-        <w:t>/</w:t>
-      </w:r>
-      <w:r>
-        <w:rPr/>
-        <w:t xml:space="preserve">실험 절차 </w:t>
-      </w:r>
-      <w:r>
-        <w:rPr/>
-        <w:t xml:space="preserve">+ </w:t>
-      </w:r>
-      <w:r>
-        <w:rPr/>
-        <w:t>결과 그래프 임베드</w:t>
-      </w:r>
-      <w:r>
-        <w:rPr/>
-        <w:t xml:space="preserve">), </w:t>
-      </w:r>
-      <w:r>
-        <w:rPr/>
-        <w:t>결과 차트</w:t>
-      </w:r>
-      <w:r>
-        <w:rPr/>
-        <w:t>/CSV</w:t>
-      </w:r>
-      <w:r>
-        <w:rPr/>
-        <w:t xml:space="preserve">는 </w:t>
-      </w:r>
-      <w:r>
-        <w:rPr>
-          <w:rStyle w:val="SourceText"/>
-        </w:rPr>
-        <w:t>results/</w:t>
-      </w:r>
-      <w:r>
-        <w:rPr/>
-        <w:t>에 포함</w:t>
-      </w:r>
-      <w:r>
-        <w:rPr/>
-        <w:t xml:space="preserve">. </w:t>
-      </w:r>
-    </w:p>
-    <w:p>
-      <w:pPr>
-        <w:pStyle w:val="Heading3"/>
-        <w:bidi w:val="0"/>
-        <w:jc w:val="left"/>
-        <w:rPr/>
-      </w:pPr>
-      <w:bookmarkStart w:id="26" w:name="55"/>
-      <w:bookmarkEnd w:id="26"/>
-      <w:r>
-        <w:rPr/>
-        <w:t xml:space="preserve">5.5 </w:t>
-      </w:r>
-      <w:r>
-        <w:rPr/>
-        <w:t>한계 및 향후 과제</w:t>
       </w:r>
     </w:p>
     <w:p>
@@ -8562,23 +9364,41 @@
       </w:pPr>
       <w:r>
         <w:rPr/>
-        <w:t xml:space="preserve">LayerNorm/residual/dropout </w:t>
-      </w:r>
-      <w:r>
-        <w:rPr/>
-        <w:t>미포함</w:t>
-      </w:r>
-      <w:r>
-        <w:rPr/>
-        <w:t>(</w:t>
-      </w:r>
-      <w:r>
-        <w:rPr/>
-        <w:t>블록 단순화</w:t>
-      </w:r>
-      <w:r>
-        <w:rPr/>
-        <w:t xml:space="preserve">). </w:t>
+        <w:t>빌드</w:t>
+      </w:r>
+      <w:r>
+        <w:rPr/>
+        <w:t xml:space="preserve">: </w:t>
+      </w:r>
+      <w:r>
+        <w:rPr>
+          <w:rStyle w:val="SourceText"/>
+        </w:rPr>
+        <w:t>CMakeLists.txt</w:t>
+      </w:r>
+      <w:r>
+        <w:rPr/>
+        <w:t xml:space="preserve">, </w:t>
+      </w:r>
+      <w:r>
+        <w:rPr>
+          <w:rStyle w:val="SourceText"/>
+        </w:rPr>
+        <w:t>docker/Dockerfile</w:t>
+      </w:r>
+      <w:r>
+        <w:rPr/>
+        <w:t>+</w:t>
+      </w:r>
+      <w:r>
+        <w:rPr>
+          <w:rStyle w:val="SourceText"/>
+        </w:rPr>
+        <w:t>docker-compose.yml</w:t>
+      </w:r>
+      <w:r>
+        <w:rPr/>
+        <w:t xml:space="preserve"> </w:t>
       </w:r>
     </w:p>
     <w:p>
@@ -8600,31 +9420,39 @@
       </w:pPr>
       <w:r>
         <w:rPr/>
-        <w:t>GEMM</w:t>
-      </w:r>
-      <w:r>
-        <w:rPr/>
-        <w:t xml:space="preserve">이 </w:t>
-      </w:r>
-      <w:r>
-        <w:rPr/>
-        <w:t>peak</w:t>
-      </w:r>
-      <w:r>
-        <w:rPr/>
-        <w:t xml:space="preserve">의 </w:t>
-      </w:r>
-      <w:r>
-        <w:rPr/>
-        <w:t>~4% → register blocking/</w:t>
-      </w:r>
-      <w:r>
-        <w:rPr/>
-        <w:t>벡터화로 개선 여지</w:t>
-      </w:r>
-      <w:r>
-        <w:rPr/>
-        <w:t xml:space="preserve">. </w:t>
+        <w:t>테스트</w:t>
+      </w:r>
+      <w:r>
+        <w:rPr/>
+        <w:t xml:space="preserve">: </w:t>
+      </w:r>
+      <w:r>
+        <w:rPr>
+          <w:rStyle w:val="SourceText"/>
+        </w:rPr>
+        <w:t>tests/</w:t>
+      </w:r>
+      <w:r>
+        <w:rPr/>
+        <w:t xml:space="preserve">, </w:t>
+      </w:r>
+      <w:r>
+        <w:rPr/>
+        <w:t>스크립트</w:t>
+      </w:r>
+      <w:r>
+        <w:rPr/>
+        <w:t xml:space="preserve">: </w:t>
+      </w:r>
+      <w:r>
+        <w:rPr>
+          <w:rStyle w:val="SourceText"/>
+        </w:rPr>
+        <w:t>scripts/</w:t>
+      </w:r>
+      <w:r>
+        <w:rPr/>
+        <w:t xml:space="preserve"> </w:t>
       </w:r>
     </w:p>
     <w:p>
@@ -8639,42 +9467,95 @@
           <w:tab w:val="left" w:pos="709" w:leader="none"/>
         </w:tabs>
         <w:bidi w:val="0"/>
-        <w:spacing w:before="0" w:after="0"/>
         <w:ind w:left="709" w:hanging="283"/>
         <w:jc w:val="left"/>
         <w:rPr/>
       </w:pPr>
       <w:r>
-        <w:rPr/>
-        <w:t xml:space="preserve">단일 </w:t>
-      </w:r>
-      <w:r>
-        <w:rPr/>
-        <w:t xml:space="preserve">GPU </w:t>
-      </w:r>
-      <w:r>
-        <w:rPr/>
-        <w:t xml:space="preserve">공유로 워커 스케일링 한계 → 다중 </w:t>
-      </w:r>
-      <w:r>
-        <w:rPr/>
-        <w:t xml:space="preserve">GPU </w:t>
-      </w:r>
-      <w:r>
-        <w:rPr/>
-        <w:t xml:space="preserve">또는 </w:t>
-      </w:r>
-      <w:r>
-        <w:rPr/>
-        <w:t>MPS/</w:t>
-      </w:r>
-      <w:r>
-        <w:rPr/>
-        <w:t>스트림 다중화</w:t>
+        <w:rPr>
+          <w:rStyle w:val="SourceText"/>
+        </w:rPr>
+        <w:t>README.md</w:t>
+      </w:r>
+      <w:r>
+        <w:rPr/>
+        <w:t>(</w:t>
+      </w:r>
+      <w:r>
+        <w:rPr/>
+        <w:t>빌드</w:t>
+      </w:r>
+      <w:r>
+        <w:rPr/>
+        <w:t>/</w:t>
+      </w:r>
+      <w:r>
+        <w:rPr/>
+        <w:t>실행</w:t>
+      </w:r>
+      <w:r>
+        <w:rPr/>
+        <w:t>/</w:t>
+      </w:r>
+      <w:r>
+        <w:rPr/>
+        <w:t xml:space="preserve">실험 절차 </w:t>
+      </w:r>
+      <w:r>
+        <w:rPr/>
+        <w:t xml:space="preserve">+ </w:t>
+      </w:r>
+      <w:r>
+        <w:rPr/>
+        <w:t>결과 그래프 임베드</w:t>
+      </w:r>
+      <w:r>
+        <w:rPr/>
+        <w:t xml:space="preserve">), </w:t>
+      </w:r>
+      <w:r>
+        <w:rPr/>
+        <w:t>결과 차트</w:t>
+      </w:r>
+      <w:r>
+        <w:rPr/>
+        <w:t>/CSV</w:t>
+      </w:r>
+      <w:r>
+        <w:rPr/>
+        <w:t xml:space="preserve">는 </w:t>
+      </w:r>
+      <w:r>
+        <w:rPr>
+          <w:rStyle w:val="SourceText"/>
+        </w:rPr>
+        <w:t>results/</w:t>
+      </w:r>
+      <w:r>
+        <w:rPr/>
+        <w:t>에 포함</w:t>
       </w:r>
       <w:r>
         <w:rPr/>
         <w:t xml:space="preserve">. </w:t>
+      </w:r>
+    </w:p>
+    <w:p>
+      <w:pPr>
+        <w:pStyle w:val="Heading3"/>
+        <w:bidi w:val="0"/>
+        <w:jc w:val="left"/>
+        <w:rPr/>
+      </w:pPr>
+      <w:bookmarkStart w:id="26" w:name="55"/>
+      <w:bookmarkEnd w:id="26"/>
+      <w:r>
+        <w:rPr/>
+        <w:t xml:space="preserve">5.5 </w:t>
+      </w:r>
+      <w:r>
+        <w:rPr/>
+        <w:t>한계 및 향후 과제</w:t>
       </w:r>
     </w:p>
     <w:p>
@@ -8682,7 +9563,141 @@
         <w:pStyle w:val="TextBody"/>
         <w:numPr>
           <w:ilvl w:val="0"/>
-          <w:numId w:val="10"/>
+          <w:numId w:val="11"/>
+        </w:numPr>
+        <w:tabs>
+          <w:tab w:val="clear" w:pos="709"/>
+          <w:tab w:val="left" w:pos="709" w:leader="none"/>
+        </w:tabs>
+        <w:bidi w:val="0"/>
+        <w:spacing w:before="0" w:after="0"/>
+        <w:ind w:left="709" w:hanging="283"/>
+        <w:jc w:val="left"/>
+        <w:rPr/>
+      </w:pPr>
+      <w:r>
+        <w:rPr/>
+        <w:t xml:space="preserve">LayerNorm/residual/dropout </w:t>
+      </w:r>
+      <w:r>
+        <w:rPr/>
+        <w:t>미포함</w:t>
+      </w:r>
+      <w:r>
+        <w:rPr/>
+        <w:t>(</w:t>
+      </w:r>
+      <w:r>
+        <w:rPr/>
+        <w:t>블록 단순화</w:t>
+      </w:r>
+      <w:r>
+        <w:rPr/>
+        <w:t xml:space="preserve">). </w:t>
+      </w:r>
+    </w:p>
+    <w:p>
+      <w:pPr>
+        <w:pStyle w:val="TextBody"/>
+        <w:numPr>
+          <w:ilvl w:val="0"/>
+          <w:numId w:val="11"/>
+        </w:numPr>
+        <w:tabs>
+          <w:tab w:val="clear" w:pos="709"/>
+          <w:tab w:val="left" w:pos="709" w:leader="none"/>
+        </w:tabs>
+        <w:bidi w:val="0"/>
+        <w:spacing w:before="0" w:after="0"/>
+        <w:ind w:left="709" w:hanging="283"/>
+        <w:jc w:val="left"/>
+        <w:rPr/>
+      </w:pPr>
+      <w:r>
+        <w:rPr/>
+        <w:t>GEMM</w:t>
+      </w:r>
+      <w:r>
+        <w:rPr/>
+        <w:t xml:space="preserve">이 </w:t>
+      </w:r>
+      <w:r>
+        <w:rPr/>
+        <w:t>peak</w:t>
+      </w:r>
+      <w:r>
+        <w:rPr/>
+        <w:t xml:space="preserve">의 </w:t>
+      </w:r>
+      <w:r>
+        <w:rPr/>
+        <w:t>~4% → register blocking/</w:t>
+      </w:r>
+      <w:r>
+        <w:rPr/>
+        <w:t>벡터화로 개선 여지</w:t>
+      </w:r>
+      <w:r>
+        <w:rPr/>
+        <w:t xml:space="preserve">. </w:t>
+      </w:r>
+    </w:p>
+    <w:p>
+      <w:pPr>
+        <w:pStyle w:val="TextBody"/>
+        <w:numPr>
+          <w:ilvl w:val="0"/>
+          <w:numId w:val="11"/>
+        </w:numPr>
+        <w:tabs>
+          <w:tab w:val="clear" w:pos="709"/>
+          <w:tab w:val="left" w:pos="709" w:leader="none"/>
+        </w:tabs>
+        <w:bidi w:val="0"/>
+        <w:spacing w:before="0" w:after="0"/>
+        <w:ind w:left="709" w:hanging="283"/>
+        <w:jc w:val="left"/>
+        <w:rPr/>
+      </w:pPr>
+      <w:r>
+        <w:rPr/>
+        <w:t xml:space="preserve">단일 </w:t>
+      </w:r>
+      <w:r>
+        <w:rPr/>
+        <w:t xml:space="preserve">GPU </w:t>
+      </w:r>
+      <w:r>
+        <w:rPr/>
+        <w:t xml:space="preserve">공유로 워커 스케일링 한계 → 다중 </w:t>
+      </w:r>
+      <w:r>
+        <w:rPr/>
+        <w:t xml:space="preserve">GPU </w:t>
+      </w:r>
+      <w:r>
+        <w:rPr/>
+        <w:t xml:space="preserve">또는 </w:t>
+      </w:r>
+      <w:r>
+        <w:rPr/>
+        <w:t>MPS/</w:t>
+      </w:r>
+      <w:r>
+        <w:rPr/>
+        <w:t>스트림 다중화</w:t>
+      </w:r>
+      <w:r>
+        <w:rPr/>
+        <w:t xml:space="preserve">. </w:t>
+      </w:r>
+    </w:p>
+    <w:p>
+      <w:pPr>
+        <w:pStyle w:val="TextBody"/>
+        <w:numPr>
+          <w:ilvl w:val="0"/>
+          <w:numId w:val="11"/>
         </w:numPr>
         <w:tabs>
           <w:tab w:val="clear" w:pos="709"/>
@@ -10478,6 +11493,143 @@
     </w:lvl>
   </w:abstractNum>
   <w:abstractNum w:abstractNumId="11">
+    <w:lvl w:ilvl="0">
+      <w:start w:val="1"/>
+      <w:numFmt w:val="bullet"/>
+      <w:lvlText w:val=""/>
+      <w:lvlJc w:val="left"/>
+      <w:pPr>
+        <w:tabs>
+          <w:tab w:val="num" w:pos="709"/>
+        </w:tabs>
+        <w:ind w:left="709" w:hanging="283"/>
+      </w:pPr>
+      <w:rPr>
+        <w:rFonts w:ascii="Symbol" w:hAnsi="Symbol" w:cs="Symbol" w:hint="default"/>
+      </w:rPr>
+    </w:lvl>
+    <w:lvl w:ilvl="1">
+      <w:start w:val="1"/>
+      <w:numFmt w:val="bullet"/>
+      <w:lvlText w:val=""/>
+      <w:lvlJc w:val="left"/>
+      <w:pPr>
+        <w:tabs>
+          <w:tab w:val="num" w:pos="1418"/>
+        </w:tabs>
+        <w:ind w:left="1418" w:hanging="283"/>
+      </w:pPr>
+      <w:rPr>
+        <w:rFonts w:ascii="Symbol" w:hAnsi="Symbol" w:cs="Symbol" w:hint="default"/>
+      </w:rPr>
+    </w:lvl>
+    <w:lvl w:ilvl="2">
+      <w:start w:val="1"/>
+      <w:numFmt w:val="bullet"/>
+      <w:lvlText w:val=""/>
+      <w:lvlJc w:val="left"/>
+      <w:pPr>
+        <w:tabs>
+          <w:tab w:val="num" w:pos="2127"/>
+        </w:tabs>
+        <w:ind w:left="2127" w:hanging="283"/>
+      </w:pPr>
+      <w:rPr>
+        <w:rFonts w:ascii="Symbol" w:hAnsi="Symbol" w:cs="Symbol" w:hint="default"/>
+      </w:rPr>
+    </w:lvl>
+    <w:lvl w:ilvl="3">
+      <w:start w:val="1"/>
+      <w:numFmt w:val="bullet"/>
+      <w:lvlText w:val=""/>
+      <w:lvlJc w:val="left"/>
+      <w:pPr>
+        <w:tabs>
+          <w:tab w:val="num" w:pos="2836"/>
+        </w:tabs>
+        <w:ind w:left="2836" w:hanging="283"/>
+      </w:pPr>
+      <w:rPr>
+        <w:rFonts w:ascii="Symbol" w:hAnsi="Symbol" w:cs="Symbol" w:hint="default"/>
+      </w:rPr>
+    </w:lvl>
+    <w:lvl w:ilvl="4">
+      <w:start w:val="1"/>
+      <w:numFmt w:val="bullet"/>
+      <w:lvlText w:val=""/>
+      <w:lvlJc w:val="left"/>
+      <w:pPr>
+        <w:tabs>
+          <w:tab w:val="num" w:pos="3545"/>
+        </w:tabs>
+        <w:ind w:left="3545" w:hanging="283"/>
+      </w:pPr>
+      <w:rPr>
+        <w:rFonts w:ascii="Symbol" w:hAnsi="Symbol" w:cs="Symbol" w:hint="default"/>
+      </w:rPr>
+    </w:lvl>
+    <w:lvl w:ilvl="5">
+      <w:start w:val="1"/>
+      <w:numFmt w:val="bullet"/>
+      <w:lvlText w:val=""/>
+      <w:lvlJc w:val="left"/>
+      <w:pPr>
+        <w:tabs>
+          <w:tab w:val="num" w:pos="4254"/>
+        </w:tabs>
+        <w:ind w:left="4254" w:hanging="283"/>
+      </w:pPr>
+      <w:rPr>
+        <w:rFonts w:ascii="Symbol" w:hAnsi="Symbol" w:cs="Symbol" w:hint="default"/>
+      </w:rPr>
+    </w:lvl>
+    <w:lvl w:ilvl="6">
+      <w:start w:val="1"/>
+      <w:numFmt w:val="bullet"/>
+      <w:lvlText w:val=""/>
+      <w:lvlJc w:val="left"/>
+      <w:pPr>
+        <w:tabs>
+          <w:tab w:val="num" w:pos="4963"/>
+        </w:tabs>
+        <w:ind w:left="4963" w:hanging="283"/>
+      </w:pPr>
+      <w:rPr>
+        <w:rFonts w:ascii="Symbol" w:hAnsi="Symbol" w:cs="Symbol" w:hint="default"/>
+      </w:rPr>
+    </w:lvl>
+    <w:lvl w:ilvl="7">
+      <w:start w:val="1"/>
+      <w:numFmt w:val="bullet"/>
+      <w:lvlText w:val=""/>
+      <w:lvlJc w:val="left"/>
+      <w:pPr>
+        <w:tabs>
+          <w:tab w:val="num" w:pos="5672"/>
+        </w:tabs>
+        <w:ind w:left="5672" w:hanging="283"/>
+      </w:pPr>
+      <w:rPr>
+        <w:rFonts w:ascii="Symbol" w:hAnsi="Symbol" w:cs="Symbol" w:hint="default"/>
+      </w:rPr>
+    </w:lvl>
+    <w:lvl w:ilvl="8">
+      <w:start w:val="1"/>
+      <w:numFmt w:val="bullet"/>
+      <w:lvlText w:val=""/>
+      <w:lvlJc w:val="left"/>
+      <w:pPr>
+        <w:tabs>
+          <w:tab w:val="num" w:pos="6381"/>
+        </w:tabs>
+        <w:ind w:left="6381" w:hanging="283"/>
+      </w:pPr>
+      <w:rPr>
+        <w:rFonts w:ascii="Symbol" w:hAnsi="Symbol" w:cs="Symbol" w:hint="default"/>
+      </w:rPr>
+    </w:lvl>
+  </w:abstractNum>
+  <w:abstractNum w:abstractNumId="12">
     <w:lvl w:ilvl="0">
       <w:start w:val="1"/>
       <w:pStyle w:val="Heading1"/>
@@ -10631,6 +11783,9 @@
   </w:num>
   <w:num w:numId="11">
     <w:abstractNumId w:val="11"/>
+  </w:num>
+  <w:num w:numId="12">
+    <w:abstractNumId w:val="12"/>
   </w:num>
 </w:numbering>
 </file>

</xml_diff>